<commit_message>
Added about, related projects, and guides pages. As well as features such as background music and universal banner.
</commit_message>
<xml_diff>
--- a/Text Writeup.docx
+++ b/Text Writeup.docx
@@ -39,6 +39,28 @@
       </w:r>
       <w:r>
         <w:t>f the possibilities of modern emulation. The rom provided is a fanmade recreation of the popular game ‘Flappy Bird’, but through the emulation of a Gameboy Advance on modern computing hardware.</w:t>
+      </w:r>
+    </w:p>
+    <w:p/>
+    <w:p>
+      <w:pPr>
+        <w:pBdr>
+          <w:bottom w:val="single" w:sz="6" w:space="1" w:color="auto"/>
+        </w:pBdr>
+      </w:pPr>
+      <w:r>
+        <w:t>About</w:t>
+      </w:r>
+    </w:p>
+    <w:p>
+      <w:r>
+        <w:t>Hallo! I built this website because I thought it’d be fun to practice my HTML skills while working</w:t>
+      </w:r>
+      <w:r>
+        <w:t xml:space="preserve"> with a hobby I enjoy.</w:t>
+      </w:r>
+      <w:r>
+        <w:t xml:space="preserve"> The information on each page should hopefully stay relevant for long after I’ve created the site, because I know I won’t be super active in maintaining the page.</w:t>
       </w:r>
     </w:p>
     <w:sectPr>
@@ -654,6 +676,7 @@
   <w:style w:type="character" w:default="1" w:styleId="DefaultParagraphFont">
     <w:name w:val="Default Paragraph Font"/>
     <w:uiPriority w:val="1"/>
+    <w:semiHidden/>
     <w:unhideWhenUsed/>
   </w:style>
   <w:style w:type="table" w:default="1" w:styleId="TableNormal">

</xml_diff>